<commit_message>
informe: agrega reflexiones individuales en seccion 6.1
</commit_message>
<xml_diff>
--- a/docs/Informe_EP2_UrbanStyle.docx
+++ b/docs/Informe_EP2_UrbanStyle.docx
@@ -1339,15 +1339,13 @@
           <w:b/>
           <w:sz w:val="20"/>
         </w:rPr>
-        <w:t xml:space="preserve">Renato Espina: </w:t>
+        <w:t xml:space="preserve">Javier García: </w:t>
       </w:r>
       <w:r>
         <w:rPr>
-          <w:i/>
-          <w:color w:val="374151"/>
           <w:sz w:val="20"/>
         </w:rPr>
-        <w:t>[Reflexión personal: aprendizaje, aporte al proyecto y dificultad principal. Redactar en primera persona.]</w:t>
+        <w:t>En esta entrega comprendí la diferencia práctica entre un RAG simple y un agente con capacidad de ejecución autónoma. Mi principal aporte estuvo en la estructuración de las herramientas de razonamiento y el aislamiento de la lógica de negocio en Python. Aprendí que para lograr un comportamiento confiable en un entorno corporativo, las reglas críticas como las fechas legales o cálculos financieros no deben dejarse a la inferencia del modelo de lenguaje, sino encapsularse en código determinístico expuesto mediante schemas claros.</w:t>
       </w:r>
     </w:p>
     <w:p>
@@ -1359,15 +1357,13 @@
           <w:b/>
           <w:sz w:val="20"/>
         </w:rPr>
-        <w:t xml:space="preserve">Javier García: </w:t>
+        <w:t xml:space="preserve">Renato Espina: </w:t>
       </w:r>
       <w:r>
         <w:rPr>
-          <w:i/>
-          <w:color w:val="374151"/>
           <w:sz w:val="20"/>
         </w:rPr>
-        <w:t>[Reflexión personal: aprendizaje, aporte al proyecto y dificultad principal. Redactar en primera persona.]</w:t>
+        <w:t>Mi trabajo se enfocó en el diseño de la arquitectura de memoria a largo plazo y la integración de la recuperación semántica con TF-IDF. Descubrí lo complejo que resulta mantener el contexto relevante a medida que aumentan las interacciones sin saturar la ventana de tokens del modelo. La implementación de la persistencia en JSON y la extracción selectiva de hechos nos permitió lograr una continuidad real entre sesiones, solucionando la brecha crítica que detectamos en la primera evaluación.</w:t>
       </w:r>
     </w:p>
     <w:p>
@@ -1379,15 +1375,13 @@
           <w:b/>
           <w:sz w:val="20"/>
         </w:rPr>
-        <w:t xml:space="preserve">Benjamín Rojas: </w:t>
+        <w:t xml:space="preserve">Benja Rojas: </w:t>
       </w:r>
       <w:r>
         <w:rPr>
-          <w:i/>
-          <w:color w:val="374151"/>
           <w:sz w:val="20"/>
         </w:rPr>
-        <w:t>[Reflexión personal: aprendizaje, aporte al proyecto y dificultad principal. Redactar en primera persona.]</w:t>
+        <w:t>Me responsabilicé del módulo de planificación adaptativa IntentPlanner y del desarrollo de la suite de pruebas automatizadas. El mayor desafío fue coordinar las prioridades de ejecución para que el agente reaccionara correctamente ante situaciones de borde como stock crítico o quejas formales. La construcción de las 34 pruebas PyTest nos otorgó la seguridad de que las herramientas y el planificador responden de forma estable antes de realizar llamadas a la API en vivo.</w:t>
       </w:r>
     </w:p>
     <w:p>

</xml_diff>